<commit_message>
Final formative CW3 draft: italics, metadata cleaned
Co-Authored-By: Claude Sonnet 5.5 <noreply@anthropic.com>
Claude-Session: https://claude.ai/code/session_01SJDfuviSYu7Z96SwMJrGH3
</commit_message>
<xml_diff>
--- a/out/Formative_CW3_final.docx
+++ b/out/Formative_CW3_final.docx
@@ -198,67 +198,184 @@
     </w:p>
     <w:p>
       <w:r>
-        <w:t>Antonakis, J., Ashkanasy, N.M. and Dasborough, M.T. (2009) 'Does leadership need emotional intelligence?', The Leadership Quarterly, 20(2), pp. 247–261.</w:t>
+        <w:t xml:space="preserve">Antonakis, J., Ashkanasy, N.M. and Dasborough, M.T. (2009) 'Does leadership need emotional intelligence?', </w:t>
+      </w:r>
+      <w:r>
+        <w:rPr>
+          <w:i/>
+        </w:rPr>
+        <w:t>The Leadership Quarterly</w:t>
+      </w:r>
+      <w:r>
+        <w:t xml:space="preserve">, 20(2), pp. 247–261.</w:t>
       </w:r>
     </w:p>
     <w:p>
       <w:r>
-        <w:t>Bass, B.M. (1985) Leadership and performance beyond expectations. New York: Free Press.</w:t>
+        <w:t xml:space="preserve">Bass, B.M. (1985) </w:t>
+      </w:r>
+      <w:r>
+        <w:rPr>
+          <w:i/>
+        </w:rPr>
+        <w:t>Leadership and performance beyond expectations</w:t>
+      </w:r>
+      <w:r>
+        <w:t xml:space="preserve">. New York: Free Press.</w:t>
       </w:r>
     </w:p>
     <w:p>
       <w:r>
-        <w:t>Eagly, A.H. and Carli, L.L. (2007) Through the labyrinth: the truth about how women become leaders. Boston, MA: Harvard Business School Press.</w:t>
+        <w:t xml:space="preserve">Eagly, A.H. and Carli, L.L. (2007) </w:t>
+      </w:r>
+      <w:r>
+        <w:rPr>
+          <w:i/>
+        </w:rPr>
+        <w:t>Through the labyrinth: the truth about how women become leaders</w:t>
+      </w:r>
+      <w:r>
+        <w:t xml:space="preserve">. Boston, MA: Harvard Business School Press.</w:t>
       </w:r>
     </w:p>
     <w:p>
       <w:r>
-        <w:t>Eagly, A.H. and Karau, S.J. (2002) 'Role congruity theory of prejudice toward female leaders', Psychological Review, 109(3), pp. 573–598. doi:10.1037/0033-295X.109.3.573.</w:t>
+        <w:t xml:space="preserve">Eagly, A.H. and Karau, S.J. (2002) 'Role congruity theory of prejudice toward female leaders', </w:t>
+      </w:r>
+      <w:r>
+        <w:rPr>
+          <w:i/>
+        </w:rPr>
+        <w:t>Psychological Review</w:t>
+      </w:r>
+      <w:r>
+        <w:t xml:space="preserve">, 109(3), pp. 573–598. doi:10.1037/0033-295X.109.3.573.</w:t>
       </w:r>
     </w:p>
     <w:p>
       <w:r>
-        <w:t>General Motors (no date) Mary Barra. Available at: https://www.gm.com/company/leadership.detail.html/Pages/bios/global/en/corporate-officers/Mary-Barra (Accessed: 15 October 2026).</w:t>
+        <w:t xml:space="preserve">General Motors (no date) </w:t>
+      </w:r>
+      <w:r>
+        <w:rPr>
+          <w:i/>
+        </w:rPr>
+        <w:t>Mary Barra</w:t>
+      </w:r>
+      <w:r>
+        <w:t xml:space="preserve">. Available at: https://www.gm.com/company/leadership.detail.html/Pages/bios/global/en/corporate-officers/Mary-Barra (Accessed: 15 October 2026).</w:t>
       </w:r>
     </w:p>
     <w:p>
       <w:r>
-        <w:t>Goleman, D. (1998) 'What makes a leader?', Harvard Business Review, 76(6), pp. 93–102.</w:t>
+        <w:t xml:space="preserve">Goleman, D. (1998) 'What makes a leader?', </w:t>
+      </w:r>
+      <w:r>
+        <w:rPr>
+          <w:i/>
+        </w:rPr>
+        <w:t>Harvard Business Review</w:t>
+      </w:r>
+      <w:r>
+        <w:t xml:space="preserve">, 76(6), pp. 93–102.</w:t>
       </w:r>
     </w:p>
     <w:p>
       <w:r>
-        <w:t>Goleman, D. (2000) 'Leadership that gets results', Harvard Business Review, 78(2), pp. 78–90.</w:t>
+        <w:t xml:space="preserve">Goleman, D. (2000) 'Leadership that gets results', </w:t>
+      </w:r>
+      <w:r>
+        <w:rPr>
+          <w:i/>
+        </w:rPr>
+        <w:t>Harvard Business Review</w:t>
+      </w:r>
+      <w:r>
+        <w:t xml:space="preserve">, 78(2), pp. 78–90.</w:t>
       </w:r>
     </w:p>
     <w:p>
       <w:r>
-        <w:t>Kotter, J.P. (1990) 'What leaders really do', Harvard Business Review, 68(3), pp. 103–111.</w:t>
+        <w:t xml:space="preserve">Kotter, J.P. (1990) 'What leaders really do', </w:t>
+      </w:r>
+      <w:r>
+        <w:rPr>
+          <w:i/>
+        </w:rPr>
+        <w:t>Harvard Business Review</w:t>
+      </w:r>
+      <w:r>
+        <w:t xml:space="preserve">, 68(3), pp. 103–111.</w:t>
       </w:r>
     </w:p>
     <w:p>
       <w:r>
-        <w:t>Mayer, R.C., Davis, J.H. and Schoorman, F.D. (1995) 'An integrative model of organizational trust', Academy of Management Review, 20(3), pp. 709–734.</w:t>
+        <w:t xml:space="preserve">Mayer, R.C., Davis, J.H. and Schoorman, F.D. (1995) 'An integrative model of organizational trust', </w:t>
+      </w:r>
+      <w:r>
+        <w:rPr>
+          <w:i/>
+        </w:rPr>
+        <w:t>Academy of Management Review</w:t>
+      </w:r>
+      <w:r>
+        <w:t xml:space="preserve">, 20(3), pp. 709–734.</w:t>
       </w:r>
     </w:p>
     <w:p>
       <w:r>
-        <w:t>Mintzberg, H. (1973) The nature of managerial work. New York: Harper &amp; Row.</w:t>
+        <w:t xml:space="preserve">Mintzberg, H. (1973) </w:t>
+      </w:r>
+      <w:r>
+        <w:rPr>
+          <w:i/>
+        </w:rPr>
+        <w:t>The nature of managerial work</w:t>
+      </w:r>
+      <w:r>
+        <w:t xml:space="preserve">. New York: Harper &amp; Row.</w:t>
       </w:r>
     </w:p>
     <w:p>
       <w:r>
-        <w:t>Northouse, P.G. (2021) Leadership: theory and practice. 9th edn. Thousand Oaks, CA: SAGE Publications.</w:t>
+        <w:t xml:space="preserve">Northouse, P.G. (2021) </w:t>
+      </w:r>
+      <w:r>
+        <w:rPr>
+          <w:i/>
+        </w:rPr>
+        <w:t>Leadership: theory and practice</w:t>
+      </w:r>
+      <w:r>
+        <w:t xml:space="preserve">. 9th edn. Thousand Oaks, CA: SAGE Publications.</w:t>
       </w:r>
     </w:p>
     <w:p>
       <w:r>
-        <w:t>Voina, A. and Stoica, M.S. (2023) 'Reframing leadership: Jacinda Ardern's response to the Covid-19 pandemic', Media and Communication, 11(1), pp. 139–149. doi:10.17645/mac.v11i1.6045.</w:t>
+        <w:t xml:space="preserve">Voina, A. and Stoica, M.S. (2023) 'Reframing leadership: Jacinda Ardern's response to the Covid-19 pandemic', </w:t>
+      </w:r>
+      <w:r>
+        <w:rPr>
+          <w:i/>
+        </w:rPr>
+        <w:t>Media and Communication</w:t>
+      </w:r>
+      <w:r>
+        <w:t xml:space="preserve">, 11(1), pp. 139–149. doi:10.17645/mac.v11i1.6045.</w:t>
       </w:r>
     </w:p>
     <w:p>
       <w:r>
-        <w:t>Wilson, S. (2020) 'Pandemic leadership: lessons from New Zealand's approach to COVID-19', Leadership, 16(3), pp. 279–293. doi:10.1177/1742715020929151.</w:t>
+        <w:t xml:space="preserve">Wilson, S. (2020) 'Pandemic leadership: lessons from New Zealand's approach to COVID-19', </w:t>
+      </w:r>
+      <w:r>
+        <w:rPr>
+          <w:i/>
+        </w:rPr>
+        <w:t>Leadership</w:t>
+      </w:r>
+      <w:r>
+        <w:t xml:space="preserve">, 16(3), pp. 279–293. doi:10.1177/1742715020929151.</w:t>
       </w:r>
     </w:p>
     <w:sectPr>

</xml_diff>